<commit_message>
tạo trang thanh toán + trang đơn hàng của tôi
</commit_message>
<xml_diff>
--- a/BaoCao_ChuyenNganh.docx
+++ b/BaoCao_ChuyenNganh.docx
@@ -326,57 +326,31 @@
     </w:p>
     <w:p>
       <w:pPr>
-        <w:spacing w:after="0" w:line="360" w:lineRule="auto"/>
-        <w:rPr>
-          <w:rFonts w:ascii="Times New Roman" w:hAnsi="Times New Roman" w:cs="Times New Roman"/>
+        <w:pStyle w:val="Style8"/>
+        <w:rPr>
           <w:b/>
-          <w:sz w:val="28"/>
-          <w:szCs w:val="28"/>
-        </w:rPr>
-      </w:pPr>
-      <w:r>
-        <w:rPr>
-          <w:rFonts w:ascii="Times New Roman" w:hAnsi="Times New Roman" w:cs="Times New Roman"/>
+        </w:rPr>
+      </w:pPr>
+      <w:r>
+        <w:rPr>
           <w:b/>
-          <w:sz w:val="28"/>
-          <w:szCs w:val="28"/>
         </w:rPr>
         <w:t>Lý do chọn đề tài</w:t>
       </w:r>
     </w:p>
     <w:p>
       <w:pPr>
-        <w:pStyle w:val="NormalWeb"/>
-        <w:spacing w:before="0" w:beforeAutospacing="0" w:after="0" w:afterAutospacing="0" w:line="360" w:lineRule="auto"/>
-        <w:ind w:firstLine="720"/>
-        <w:rPr>
-          <w:sz w:val="28"/>
-          <w:szCs w:val="28"/>
-        </w:rPr>
-      </w:pPr>
-      <w:r>
-        <w:rPr>
-          <w:sz w:val="28"/>
-          <w:szCs w:val="28"/>
-        </w:rPr>
+        <w:pStyle w:val="Style8"/>
+      </w:pPr>
+      <w:r>
         <w:t>Trong thời đại thương mại điện tử phát triển mạnh mẽ, hoạt động mua sắm của khách hàng đang chuyển dịch dần sang các nền tảng trực tuyến. Tuy nhiên, nhiều cửa hàng bán thiết bị công nghệ vẫn sử dụng các hình thức giới thiệu sản phẩm truyền thống, dẫn đến việc tiếp cận khách hàng còn hạn chế và hiệu quả kinh doanh chưa cao. Bên cạnh đó, các vấn đề như quản lý sản phẩm thủ công, thiếu hệ thống đặt hàng trực tuyến, chưa có bộ phận hỗ trợ khách hàng tự động… khiến quá trình vận hành kém hiệu quả.</w:t>
       </w:r>
     </w:p>
     <w:p>
       <w:pPr>
-        <w:pStyle w:val="NormalWeb"/>
-        <w:spacing w:before="0" w:beforeAutospacing="0" w:after="0" w:afterAutospacing="0" w:line="360" w:lineRule="auto"/>
-        <w:ind w:firstLine="720"/>
-        <w:rPr>
-          <w:sz w:val="28"/>
-          <w:szCs w:val="28"/>
-        </w:rPr>
-      </w:pPr>
-      <w:r>
-        <w:rPr>
-          <w:sz w:val="28"/>
-          <w:szCs w:val="28"/>
-        </w:rPr>
+        <w:pStyle w:val="Style8"/>
+      </w:pPr>
+      <w:r>
         <w:t xml:space="preserve">Từ những thực tế nhìn nhận được, đề tài </w:t>
       </w:r>
       <w:r>
@@ -388,356 +362,358 @@
         <w:t>“Xây dựng Website cho cửa hàng bán thiết bị công nghệ” ra đời</w:t>
       </w:r>
       <w:r>
-        <w:rPr>
+        <w:t xml:space="preserve"> nhằm tạo ra một nền tảng trực tuyến giúp cửa hàng giới thiệu sản phẩm chuyên nghiệp hơn, đồng thời nâng cao trải nghiệm người dùng cũng như tối ưu công tác quản lý cửa hàng.</w:t>
+      </w:r>
+    </w:p>
+    <w:p>
+      <w:pPr>
+        <w:pStyle w:val="Style8"/>
+        <w:rPr>
+          <w:b/>
+        </w:rPr>
+      </w:pPr>
+      <w:r>
+        <w:rPr>
+          <w:b/>
+        </w:rPr>
+        <w:t>Mục đích nghiên cứu:</w:t>
+      </w:r>
+    </w:p>
+    <w:p>
+      <w:pPr>
+        <w:pStyle w:val="Style8"/>
+      </w:pPr>
+      <w:r>
+        <w:t>Xây dựng giao diện mua sắm trực tuyến hiện đại, giúp người dùng tìm kiếm, xem chi tiết, so sánh và đặt mua sản phẩm nhanh chóng.</w:t>
+      </w:r>
+    </w:p>
+    <w:p>
+      <w:pPr>
+        <w:pStyle w:val="Style8"/>
+      </w:pPr>
+      <w:r>
+        <w:t>Hỗ trợ khách hàng trong quá trình tương tác nhờ tích hợp chatbot tư vấn cơ bản.</w:t>
+      </w:r>
+    </w:p>
+    <w:p>
+      <w:pPr>
+        <w:pStyle w:val="Style8"/>
+      </w:pPr>
+      <w:r>
+        <w:t>Xây dựng hệ thống quản trị (Admin) phục vụ việc thêm, sửa, xóa và quản lý sản phẩm, khách hàng, đơn hàng và thống kê.</w:t>
+      </w:r>
+    </w:p>
+    <w:p>
+      <w:pPr>
+        <w:pStyle w:val="Style8"/>
+      </w:pPr>
+      <w:r>
+        <w:t>Tạo ra một hệ thống dễ mở rộng, dễ bảo trì và có thể áp dụng trong thực tế cho các cửa hàng kinh doanh công nghệ.</w:t>
+      </w:r>
+    </w:p>
+    <w:p>
+      <w:pPr>
+        <w:pStyle w:val="Style8"/>
+        <w:rPr>
+          <w:b/>
+        </w:rPr>
+      </w:pPr>
+      <w:r>
+        <w:rPr>
+          <w:b/>
+        </w:rPr>
+        <w:t>Đối tượng nghiên cứu:</w:t>
+      </w:r>
+    </w:p>
+    <w:p>
+      <w:pPr>
+        <w:pStyle w:val="Style8"/>
+      </w:pPr>
+      <w:r>
+        <w:rPr>
+          <w:rStyle w:val="Strong"/>
+          <w:b w:val="0"/>
           <w:sz w:val="28"/>
           <w:szCs w:val="28"/>
         </w:rPr>
-        <w:t xml:space="preserve"> nhằm tạo ra một nền tảng trực tuyến giúp cửa hàng giới thiệu sản phẩm chuyên nghiệp hơn, đồng thời nâng cao trải nghiệm người dùng cũng như tối ưu công tác quản lý cửa hàng.</w:t>
-      </w:r>
-    </w:p>
-    <w:p>
-      <w:pPr>
-        <w:pStyle w:val="NormalWeb"/>
-        <w:spacing w:before="0" w:beforeAutospacing="0" w:after="0" w:afterAutospacing="0" w:line="360" w:lineRule="auto"/>
-        <w:rPr>
-          <w:b/>
+        <w:t>Người dùng cuối (khách hàng):</w:t>
+      </w:r>
+      <w:r>
+        <w:t xml:space="preserve"> những người truy cập website để tìm kiếm và mua thiết bị công nghệ.</w:t>
+      </w:r>
+    </w:p>
+    <w:p>
+      <w:pPr>
+        <w:pStyle w:val="Style8"/>
+      </w:pPr>
+      <w:r>
+        <w:rPr>
+          <w:rStyle w:val="Strong"/>
+          <w:b w:val="0"/>
           <w:sz w:val="28"/>
           <w:szCs w:val="28"/>
         </w:rPr>
-      </w:pPr>
+        <w:t>Quản trị viên và chủ cửa hàng:</w:t>
+      </w:r>
       <w:r>
         <w:rPr>
           <w:b/>
+        </w:rPr>
+        <w:t xml:space="preserve"> </w:t>
+      </w:r>
+      <w:r>
+        <w:t>những người trực tiếp sử dụng hệ thống admin để quản lý sản phẩm, khách hàng và đơn hàng.</w:t>
+      </w:r>
+    </w:p>
+    <w:p>
+      <w:pPr>
+        <w:pStyle w:val="Style8"/>
+      </w:pPr>
+      <w:r>
+        <w:rPr>
+          <w:rStyle w:val="Strong"/>
+          <w:b w:val="0"/>
           <w:sz w:val="28"/>
           <w:szCs w:val="28"/>
         </w:rPr>
-        <w:t>Mục đích nghiên cứu:</w:t>
-      </w:r>
-    </w:p>
-    <w:p>
-      <w:pPr>
-        <w:pStyle w:val="NormalWeb"/>
-        <w:numPr>
-          <w:ilvl w:val="0"/>
-          <w:numId w:val="7"/>
-        </w:numPr>
-        <w:spacing w:before="0" w:beforeAutospacing="0" w:after="0" w:afterAutospacing="0" w:line="360" w:lineRule="auto"/>
-        <w:rPr>
-          <w:sz w:val="28"/>
-          <w:szCs w:val="28"/>
-        </w:rPr>
-      </w:pPr>
-      <w:r>
-        <w:rPr>
-          <w:sz w:val="28"/>
-          <w:szCs w:val="28"/>
-        </w:rPr>
-        <w:t>Xây dựng giao diện mua sắm trực tuyến hiện đại, giúp người dùng tìm kiếm, xem chi tiết, so sánh và đặt mua sản phẩm nhanh chóng.</w:t>
-      </w:r>
-    </w:p>
-    <w:p>
-      <w:pPr>
-        <w:pStyle w:val="NormalWeb"/>
-        <w:numPr>
-          <w:ilvl w:val="0"/>
-          <w:numId w:val="7"/>
-        </w:numPr>
-        <w:spacing w:before="0" w:beforeAutospacing="0" w:after="0" w:afterAutospacing="0" w:line="360" w:lineRule="auto"/>
-        <w:rPr>
-          <w:sz w:val="28"/>
-          <w:szCs w:val="28"/>
-        </w:rPr>
-      </w:pPr>
-      <w:r>
-        <w:rPr>
-          <w:sz w:val="28"/>
-          <w:szCs w:val="28"/>
-        </w:rPr>
-        <w:t>Hỗ trợ khách hàng trong quá trình tương tác nhờ tích hợp chatbot tư vấn cơ bản.</w:t>
-      </w:r>
-    </w:p>
-    <w:p>
-      <w:pPr>
-        <w:pStyle w:val="NormalWeb"/>
-        <w:numPr>
-          <w:ilvl w:val="0"/>
-          <w:numId w:val="7"/>
-        </w:numPr>
-        <w:spacing w:before="0" w:beforeAutospacing="0" w:after="0" w:afterAutospacing="0" w:line="360" w:lineRule="auto"/>
-        <w:rPr>
-          <w:sz w:val="28"/>
-          <w:szCs w:val="28"/>
-        </w:rPr>
-      </w:pPr>
-      <w:r>
-        <w:rPr>
-          <w:sz w:val="28"/>
-          <w:szCs w:val="28"/>
-        </w:rPr>
-        <w:t>Xây dựng hệ thống quản trị (Admin) phục vụ việc thêm, sửa, xóa và quản lý sản phẩm, khách hàng, đơn hàng và thống kê.</w:t>
-      </w:r>
-    </w:p>
-    <w:p>
-      <w:pPr>
-        <w:pStyle w:val="NormalWeb"/>
-        <w:numPr>
-          <w:ilvl w:val="0"/>
-          <w:numId w:val="7"/>
-        </w:numPr>
-        <w:spacing w:before="0" w:beforeAutospacing="0" w:after="0" w:afterAutospacing="0" w:line="360" w:lineRule="auto"/>
-        <w:rPr>
-          <w:sz w:val="28"/>
-          <w:szCs w:val="28"/>
-        </w:rPr>
-      </w:pPr>
-      <w:r>
-        <w:rPr>
-          <w:sz w:val="28"/>
-          <w:szCs w:val="28"/>
-        </w:rPr>
-        <w:t>Tạo ra một hệ thống dễ mở rộng, dễ bảo trì và có thể áp dụng trong thực tế cho các cửa hàng kinh doanh công nghệ.</w:t>
-      </w:r>
-    </w:p>
-    <w:p>
-      <w:pPr>
-        <w:pStyle w:val="NormalWeb"/>
-        <w:spacing w:before="0" w:beforeAutospacing="0" w:after="0" w:afterAutospacing="0" w:line="360" w:lineRule="auto"/>
+        <w:t>Các công nghệ web được sử dụng:</w:t>
+      </w:r>
+      <w:r>
+        <w:t xml:space="preserve"> HTML, CSS, Javascript, Tailwind CSS, NodeJS, Express và hệ quản trị cơ sở dữ liệu MySQL.</w:t>
+      </w:r>
+    </w:p>
+    <w:p>
+      <w:pPr>
+        <w:pStyle w:val="Style8"/>
         <w:rPr>
           <w:b/>
-          <w:sz w:val="28"/>
-          <w:szCs w:val="28"/>
         </w:rPr>
       </w:pPr>
       <w:r>
         <w:rPr>
           <w:b/>
-          <w:sz w:val="28"/>
-          <w:szCs w:val="28"/>
-        </w:rPr>
-        <w:t>Đối tượng nghiên cứu:</w:t>
-      </w:r>
-    </w:p>
-    <w:p>
-      <w:pPr>
-        <w:pStyle w:val="NormalWeb"/>
-        <w:numPr>
-          <w:ilvl w:val="0"/>
-          <w:numId w:val="8"/>
-        </w:numPr>
-        <w:spacing w:before="0" w:beforeAutospacing="0" w:after="0" w:afterAutospacing="0" w:line="360" w:lineRule="auto"/>
-        <w:rPr>
-          <w:sz w:val="28"/>
-          <w:szCs w:val="28"/>
-        </w:rPr>
-      </w:pPr>
+        </w:rPr>
+        <w:t>Phạm vi nghiên cứu:</w:t>
+      </w:r>
+    </w:p>
+    <w:p>
+      <w:pPr>
+        <w:pStyle w:val="Style8"/>
+      </w:pPr>
+      <w:r>
+        <w:lastRenderedPageBreak/>
+        <w:t>Xây dựng website bán hàng cơ bản cho cửa hàng thiết bị công nghệ, bao gồm các chức năng: tìm kiếm, lọc, so sánh sản phẩm, giỏ hàng, đặt hàng, thanh toán và liên hệ.</w:t>
+      </w:r>
+    </w:p>
+    <w:p>
+      <w:pPr>
+        <w:pStyle w:val="Style8"/>
+      </w:pPr>
+      <w:r>
+        <w:t>Phát triển hệ thống quản trị nội bộ cho admin: quản lý sản phẩm, tài khoản khách hàng, phản hồi và thống kê.</w:t>
+      </w:r>
+    </w:p>
+    <w:p>
+      <w:pPr>
+        <w:pStyle w:val="Style8"/>
+      </w:pPr>
+      <w:r>
+        <w:t>Tích hợp chatbot tư vấn ở mức đơn giản (kịch bản cố định, không sử dụng AI nâng cao).</w:t>
+      </w:r>
+    </w:p>
+    <w:p>
+      <w:pPr>
+        <w:pStyle w:val="Style8"/>
+      </w:pPr>
+      <w:r>
+        <w:t>Hệ thống được phát triển và chạy thử nghiệm trên môi trường lập trình VSCode, chưa triển khai trên máy chủ thực tế.</w:t>
+      </w:r>
+    </w:p>
+    <w:p>
+      <w:pPr>
+        <w:pStyle w:val="Style8"/>
+      </w:pPr>
+    </w:p>
+    <w:p>
+      <w:pPr>
+        <w:pStyle w:val="Style1"/>
+      </w:pPr>
+      <w:r>
+        <w:t>CHƯƠNG 1: TỔNG QUAN</w:t>
+      </w:r>
+    </w:p>
+    <w:p>
+      <w:pPr>
+        <w:pStyle w:val="Style8"/>
+      </w:pPr>
+      <w:r>
+        <w:t>Trong nền kinh tế số phát triển mạnh mẽ, nhu cầu tiêu dùng của khách hàng đã thay đổi rõ rệt khi việc mua sắm trực tuyến trở nên phổ biến và được ưu tiên bởi tính tiện lợi, nhanh chóng và khả năng tiếp cận thông tin đa dạng. Đặc biệt trong lĩnh vực kinh doanh thiết bị công nghệ, người dùng thường có nhu cầu tìm hiểu kỹ lưỡng về thông số kỹ thuật, so sánh giữa nhiều sản phẩm khác nhau, đánh giá chất lượng cũng như mức giá trước khi đưa ra quyết định mua hàng. Điều này khiến các cửa hàng kinh doanh thiết bị công nghệ cần phải đầu tư vào các hệ thống trực tuyến hiện đại nhằm hỗ trợ tốt hơn cho khách hàng và nâng cao hiệu quả bán hàng.</w:t>
+      </w:r>
+    </w:p>
+    <w:p>
+      <w:pPr>
+        <w:pStyle w:val="Style8"/>
+      </w:pPr>
+      <w:r>
+        <w:t>Tuy nhiên, phần lớn các cửa hàng vừa và nhỏ hiện nay vẫn quản lý sản phẩm và bán hàng theo phương thức thủ công hoặc chỉ thông qua mạng xã hội. Cách làm này không chỉ hạn chế khả năng tiếp cận khách hàng mà còn khó tối ưu quy trình vận hành, dễ dẫn đến tình trạng sai sót trong quản lý đơn hàng, thiếu thống nhất trong cập nhật sản phẩm và không đảm bảo sự chuyên nghiệp. Bên cạnh đó, khách hàng cũng gặp khó khăn khi tìm kiếm và so sánh sản phẩm do thiếu hệ thống dữ liệu đầy đủ, giao diện trực quan hoặc các công cụ hỗ trợ tự động.</w:t>
+      </w:r>
+    </w:p>
+    <w:p>
+      <w:pPr>
+        <w:pStyle w:val="Style8"/>
+      </w:pPr>
+      <w:r>
+        <w:t>Từ những vấn đề hạn chế trên, đề tài “</w:t>
+      </w:r>
       <w:r>
         <w:rPr>
           <w:rStyle w:val="Strong"/>
           <w:sz w:val="28"/>
           <w:szCs w:val="28"/>
         </w:rPr>
-        <w:t>Người dùng cuối (khách hàng):</w:t>
-      </w:r>
-      <w:r>
-        <w:rPr>
-          <w:sz w:val="28"/>
-          <w:szCs w:val="28"/>
-        </w:rPr>
-        <w:t xml:space="preserve"> những người truy cập website để tìm kiếm và mua thiết bị công nghệ.</w:t>
-      </w:r>
-    </w:p>
-    <w:p>
-      <w:pPr>
-        <w:pStyle w:val="NormalWeb"/>
-        <w:numPr>
-          <w:ilvl w:val="0"/>
-          <w:numId w:val="8"/>
-        </w:numPr>
-        <w:spacing w:before="0" w:beforeAutospacing="0" w:after="0" w:afterAutospacing="0" w:line="360" w:lineRule="auto"/>
-        <w:rPr>
-          <w:sz w:val="28"/>
-          <w:szCs w:val="28"/>
-        </w:rPr>
-      </w:pPr>
+        <w:t>Xây dựng Website cho cửa hàng bán thiết bị công nghệ</w:t>
+      </w:r>
+      <w:r>
+        <w:t xml:space="preserve">” được thực hiện nhằm giải quyết những hạn chế trong hoạt động bán hàng truyền thống, đồng thời đáp ứng nhu cầu thực tiễn của cả khách hàng và chủ cửa hàng. Đề tài tập trung nghiên cứu quá trình xây dựng một hệ thống website thương mại điện tử có tính ứng dụng cao, đáp ứng đầy đủ các chức năng cơ bản như: tìm kiếm sản phẩm, xem chi tiết thông </w:t>
+      </w:r>
+      <w:r>
+        <w:lastRenderedPageBreak/>
+        <w:t>tin, so sánh sản phẩm, giỏ hàng, đặt hàng, thanh toán và liên hệ hỗ trợ. Đối với phía cửa hàng, hệ thống cung cấp trang quản trị cho phép thực hiện các thao tác như thêm, sửa, xóa sản phẩm, quản lý tài khoản khách hàng, xem thống kê và xử lý phản hồi. Đây là những chức năng quan trọng nhằm tối ưu hóa quá trình vận hành và quản lý trong môi trường kinh doanh hiện đại.</w:t>
+      </w:r>
+    </w:p>
+    <w:p>
+      <w:pPr>
+        <w:pStyle w:val="Style8"/>
+      </w:pPr>
+      <w:r>
+        <w:t>Ngoài các chức năng truyền thống của một website bán hàng, đề tài còn tích hợp tính năng chatbot tư vấn nhằm hỗ trợ người dùng trong việc tra cứu thông tin hoặc giải đáp một số câu hỏi thường gặp. Mặc dù không sử dụng các mô hình trí tuệ nhân tạo phức tạp, chatbot vẫn góp phần nâng cao trải nghiệm và tăng mức độ tương tác của người dùng với hệ thống cửa hàng.</w:t>
+      </w:r>
+    </w:p>
+    <w:p>
+      <w:pPr>
+        <w:pStyle w:val="Style8"/>
+      </w:pPr>
+      <w:r>
+        <w:t>Phương pháp nghiên cứu của đề tài dựa trên việc kết hợp các công nghệ web</w:t>
+      </w:r>
+      <w:r>
+        <w:t xml:space="preserve"> phổ biến và mạnh mẽ hiện nay như </w:t>
+      </w:r>
       <w:r>
         <w:rPr>
           <w:rStyle w:val="Strong"/>
           <w:sz w:val="28"/>
           <w:szCs w:val="28"/>
         </w:rPr>
-        <w:t>Quản trị viên và chủ cửa hàng:</w:t>
-      </w:r>
-      <w:r>
-        <w:rPr>
-          <w:b/>
-          <w:sz w:val="28"/>
-          <w:szCs w:val="28"/>
-        </w:rPr>
-        <w:t xml:space="preserve"> </w:t>
-      </w:r>
-      <w:r>
-        <w:rPr>
-          <w:sz w:val="28"/>
-          <w:szCs w:val="28"/>
-        </w:rPr>
-        <w:t>những người trực tiếp sử dụng hệ thống admin để quản lý sản phẩm, khách hàng và đơn hàng.</w:t>
-      </w:r>
-    </w:p>
-    <w:p>
-      <w:pPr>
-        <w:pStyle w:val="NormalWeb"/>
-        <w:numPr>
-          <w:ilvl w:val="0"/>
-          <w:numId w:val="8"/>
-        </w:numPr>
-        <w:spacing w:before="0" w:beforeAutospacing="0" w:after="0" w:afterAutospacing="0" w:line="360" w:lineRule="auto"/>
-        <w:rPr>
-          <w:sz w:val="28"/>
-          <w:szCs w:val="28"/>
-        </w:rPr>
-      </w:pPr>
+        <w:t>HTML, CSS, Javascript, Tailwind CSS, NodeJS, Express</w:t>
+      </w:r>
+      <w:r>
+        <w:t xml:space="preserve"> và </w:t>
+      </w:r>
       <w:r>
         <w:rPr>
           <w:rStyle w:val="Strong"/>
           <w:sz w:val="28"/>
           <w:szCs w:val="28"/>
         </w:rPr>
-        <w:t>Các công nghệ web được sử dụng:</w:t>
-      </w:r>
-      <w:r>
-        <w:rPr>
-          <w:sz w:val="28"/>
-          <w:szCs w:val="28"/>
-        </w:rPr>
-        <w:t xml:space="preserve"> HTML, CSS, Javascript, Tailwind CSS, NodeJS, Express và hệ quản trị cơ sở dữ liệu MySQL.</w:t>
-      </w:r>
-    </w:p>
-    <w:p>
-      <w:pPr>
-        <w:spacing w:after="0" w:line="360" w:lineRule="auto"/>
-        <w:rPr>
-          <w:rFonts w:ascii="Times New Roman" w:hAnsi="Times New Roman" w:cs="Times New Roman"/>
-          <w:b/>
-          <w:sz w:val="28"/>
-          <w:szCs w:val="28"/>
-        </w:rPr>
-      </w:pPr>
-      <w:r>
-        <w:rPr>
-          <w:rFonts w:ascii="Times New Roman" w:hAnsi="Times New Roman" w:cs="Times New Roman"/>
-          <w:b/>
-          <w:sz w:val="28"/>
-          <w:szCs w:val="28"/>
-        </w:rPr>
-        <w:t>Phạm vi nghiên cứu:</w:t>
+        <w:t>MySQL</w:t>
+      </w:r>
+      <w:r>
+        <w:t>. Các công nghệ này không chỉ phù hợp với yêu cầu của đề tài mà còn đảm bảo tính dễ hiểu, dễ mở rộng, dễ bảo trì, đồng thời tạo điều kiện để vận dụng hiệu quả các kiến thức đã học vào quá trình phát triển hệ thống thực tế. Việc áp dụng mô hình kiến trúc hướng phân lớp (Layered Architecture) và mô hình Client – Server cũng giúp hệ thống đạt được sự rõ ràng trong tổ chức mã nguồn, tăng khả năng mở rộng khi cần nâng cấp trong tương lai.</w:t>
+      </w:r>
+    </w:p>
+    <w:p>
+      <w:pPr>
+        <w:pStyle w:val="Style8"/>
+      </w:pPr>
+      <w:r>
+        <w:t>Đề tài không chỉ nhằm xây dựng một sản phẩm phần mềm hoàn chỉnh phục vụ cho hoạt động kinh doanh thiết bị công nghệ, mà còn mang đến cơ hội rèn luyện tư duy phân tích, thiết kế hệ thống, lập trình frontend – backend, quản lý cơ sở dữ liệu và vận hành website thông qua quá trình nghiên cứu và triển khai. Đây đều là những kỹ năng cần thiết để đáp ứng yêu cầu nghề nghiệp trong lĩnh vực phát triển phần mềm hiện nay. Kết quả của quá trình nghiên cứu kỳ vọng mang đến một giải pháp có tính ứng dụng thực tế cao, góp phần nâng cao hiệu quả vận hành của cửa hàng và đem lại trải nghiệm tốt hơn cho người dùng.</w:t>
+      </w:r>
+    </w:p>
+    <w:p>
+      <w:pPr>
+        <w:pStyle w:val="Style1"/>
+      </w:pPr>
+      <w:r>
+        <w:t>CHƯƠNG 2: NGHIÊN CỨU LÝ THUYẾT</w:t>
+      </w:r>
+    </w:p>
+    <w:p>
+      <w:pPr>
+        <w:pStyle w:val="Style2"/>
+      </w:pPr>
+      <w:r>
+        <w:t xml:space="preserve">2.1 </w:t>
+      </w:r>
+      <w:r>
+        <w:t>HTML (HyperText Markup Language)</w:t>
+      </w:r>
+    </w:p>
+    <w:p>
+      <w:pPr>
+        <w:pStyle w:val="Style4"/>
+      </w:pPr>
+      <w:r>
+        <w:t>2.1.1 Khái niệm:</w:t>
+      </w:r>
+    </w:p>
+    <w:p>
+      <w:pPr>
+        <w:pStyle w:val="Style8"/>
+      </w:pPr>
+      <w:r>
+        <w:rPr>
+          <w:shd w:val="clear" w:color="auto" w:fill="FFFFFF"/>
+        </w:rPr>
+        <w:t>HTML là một </w:t>
+      </w:r>
+      <w:hyperlink r:id="rId7" w:tooltip="Ngôn ngữ đánh dấu" w:history="1">
+        <w:r>
+          <w:t>ngôn ngữ đánh dấu</w:t>
+        </w:r>
+      </w:hyperlink>
+      <w:r>
+        <w:rPr>
+          <w:shd w:val="clear" w:color="auto" w:fill="FFFFFF"/>
+        </w:rPr>
+        <w:t xml:space="preserve"> mà các trình duyệt web sử dụng để giải thích và soạn văn bản, hình ảnh và các tài liệu khác thành các trang web trực quan hoặc nghe được. Các đặc điểm mặc định cho mọi mục của đánh dấu HTML được xác định trong trình duyệt và các đặc </w:t>
+      </w:r>
+      <w:r>
+        <w:rPr>
+          <w:shd w:val="clear" w:color="auto" w:fill="FFFFFF"/>
+        </w:rPr>
+        <w:lastRenderedPageBreak/>
+        <w:t>điểm này có thể được thay đổi hoặc nâng cao bằng cách sử dụng thêm </w:t>
+      </w:r>
+      <w:r>
+        <w:t>CSS</w:t>
       </w:r>
       <w:bookmarkStart w:id="0" w:name="_GoBack"/>
       <w:bookmarkEnd w:id="0"/>
-    </w:p>
-    <w:p>
-      <w:pPr>
-        <w:pStyle w:val="ListParagraph"/>
-        <w:numPr>
-          <w:ilvl w:val="0"/>
-          <w:numId w:val="9"/>
-        </w:numPr>
-        <w:spacing w:after="0" w:line="360" w:lineRule="auto"/>
-        <w:rPr>
-          <w:rFonts w:ascii="Times New Roman" w:hAnsi="Times New Roman" w:cs="Times New Roman"/>
-          <w:sz w:val="28"/>
-          <w:szCs w:val="28"/>
-        </w:rPr>
-      </w:pPr>
-      <w:r>
-        <w:rPr>
-          <w:rFonts w:ascii="Times New Roman" w:hAnsi="Times New Roman" w:cs="Times New Roman"/>
-          <w:sz w:val="28"/>
-          <w:szCs w:val="28"/>
-        </w:rPr>
-        <w:lastRenderedPageBreak/>
-        <w:t>Xây dựng website bán hàng cơ bản cho cửa hàng thiết bị công nghệ, bao gồm các chức năng: tìm kiếm, lọc, so sánh sản phẩm, giỏ hàng, đặt hàng, thanh toán và liên hệ.</w:t>
-      </w:r>
-    </w:p>
-    <w:p>
-      <w:pPr>
-        <w:pStyle w:val="ListParagraph"/>
-        <w:numPr>
-          <w:ilvl w:val="0"/>
-          <w:numId w:val="9"/>
-        </w:numPr>
-        <w:spacing w:after="0" w:line="360" w:lineRule="auto"/>
-        <w:rPr>
-          <w:rFonts w:ascii="Times New Roman" w:hAnsi="Times New Roman" w:cs="Times New Roman"/>
-          <w:sz w:val="28"/>
-          <w:szCs w:val="28"/>
-        </w:rPr>
-      </w:pPr>
-      <w:r>
-        <w:rPr>
-          <w:rFonts w:ascii="Times New Roman" w:hAnsi="Times New Roman" w:cs="Times New Roman"/>
-          <w:sz w:val="28"/>
-          <w:szCs w:val="28"/>
-        </w:rPr>
-        <w:t>Phát triển hệ thống quản trị nội bộ cho admin: quản lý sản phẩm, tài khoản khách hàng, phản hồi và thống kê.</w:t>
-      </w:r>
-    </w:p>
-    <w:p>
-      <w:pPr>
-        <w:pStyle w:val="ListParagraph"/>
-        <w:numPr>
-          <w:ilvl w:val="0"/>
-          <w:numId w:val="9"/>
-        </w:numPr>
-        <w:spacing w:after="0" w:line="360" w:lineRule="auto"/>
-        <w:rPr>
-          <w:rFonts w:ascii="Times New Roman" w:hAnsi="Times New Roman" w:cs="Times New Roman"/>
-          <w:sz w:val="28"/>
-          <w:szCs w:val="28"/>
-        </w:rPr>
-      </w:pPr>
-      <w:r>
-        <w:rPr>
-          <w:rFonts w:ascii="Times New Roman" w:hAnsi="Times New Roman" w:cs="Times New Roman"/>
-          <w:sz w:val="28"/>
-          <w:szCs w:val="28"/>
-        </w:rPr>
-        <w:t>Tích hợp chatbot tư vấn ở mức đơn giản (kịch bản cố định, không sử dụng AI nâng cao).</w:t>
-      </w:r>
-    </w:p>
-    <w:p>
-      <w:pPr>
-        <w:pStyle w:val="ListParagraph"/>
-        <w:numPr>
-          <w:ilvl w:val="0"/>
-          <w:numId w:val="9"/>
-        </w:numPr>
-        <w:spacing w:after="0" w:line="360" w:lineRule="auto"/>
-        <w:rPr>
-          <w:rFonts w:ascii="Times New Roman" w:hAnsi="Times New Roman" w:cs="Times New Roman"/>
-          <w:sz w:val="28"/>
-          <w:szCs w:val="28"/>
-        </w:rPr>
-      </w:pPr>
-      <w:r>
-        <w:rPr>
-          <w:rFonts w:ascii="Times New Roman" w:hAnsi="Times New Roman" w:cs="Times New Roman"/>
-          <w:sz w:val="28"/>
-          <w:szCs w:val="28"/>
-        </w:rPr>
-        <w:t>Hệ thống được phát triển và chạy thử nghiệm trên môi trường lập trình VSCode, chưa triển khai trên máy chủ thực tế.</w:t>
-      </w:r>
-    </w:p>
-    <w:p>
-      <w:pPr>
-        <w:pStyle w:val="Style8"/>
-      </w:pPr>
+      <w:r>
+        <w:rPr>
+          <w:shd w:val="clear" w:color="auto" w:fill="FFFFFF"/>
+        </w:rPr>
+        <w:t> của nhà thiết kế trang web.</w:t>
+      </w:r>
+      <w:r>
+        <w:t xml:space="preserve"> </w:t>
+      </w:r>
+    </w:p>
+    <w:p>
+      <w:pPr>
+        <w:pStyle w:val="Style4"/>
+      </w:pPr>
+      <w:r>
+        <w:t>2.1.2 Nội dung 1.2</w:t>
+      </w:r>
     </w:p>
     <w:p>
       <w:pPr>
         <w:pStyle w:val="Style1"/>
       </w:pPr>
       <w:r>
-        <w:t>CHƯƠNG 1: TỔNG QUAN</w:t>
+        <w:t>CHƯƠNG 3: HIỆN THỰC HÓA NGHIÊN CỨU</w:t>
       </w:r>
     </w:p>
     <w:p>
@@ -745,50 +721,7 @@
         <w:pStyle w:val="Style1"/>
       </w:pPr>
       <w:r>
-        <w:t>CHƯƠNG 2: NGHIÊN CỨU LÝ THUYẾT</w:t>
-      </w:r>
-    </w:p>
-    <w:p>
-      <w:pPr>
-        <w:pStyle w:val="Style2"/>
-      </w:pPr>
-      <w:r>
-        <w:t>2.1 Nội dung 1</w:t>
-      </w:r>
-    </w:p>
-    <w:p>
-      <w:pPr>
-        <w:pStyle w:val="Style4"/>
-      </w:pPr>
-      <w:r>
-        <w:t>2.1.1 Nội dung 1.1</w:t>
-      </w:r>
-    </w:p>
-    <w:p>
-      <w:pPr>
-        <w:pStyle w:val="Style8"/>
-      </w:pPr>
-      <w:r>
-        <w:t>H</w:t>
-      </w:r>
-      <w:r>
-        <w:t>vgdfuydehwgfuwbccxncsjdncidushcisd</w:t>
-      </w:r>
-    </w:p>
-    <w:p>
-      <w:pPr>
-        <w:pStyle w:val="Style8"/>
-      </w:pPr>
-      <w:r>
-        <w:t>bydshbdhvusdni</w:t>
-      </w:r>
-    </w:p>
-    <w:p>
-      <w:pPr>
-        <w:pStyle w:val="Style4"/>
-      </w:pPr>
-      <w:r>
-        <w:t>2.1.2 Nội dung 1.2</w:t>
+        <w:t>chương 4: kết quả nghiên cứu</w:t>
       </w:r>
     </w:p>
     <w:p>
@@ -796,12 +729,12 @@
         <w:pStyle w:val="Style1"/>
       </w:pPr>
       <w:r>
-        <w:t>CHƯƠNG 3: HIỆN THỰC HÓA NGHIÊN CỨU</w:t>
+        <w:t>chương 5: kết luận và hướng phát triển</w:t>
       </w:r>
     </w:p>
     <w:sectPr>
-      <w:headerReference w:type="default" r:id="rId7"/>
-      <w:footerReference w:type="default" r:id="rId8"/>
+      <w:headerReference w:type="default" r:id="rId8"/>
+      <w:footerReference w:type="default" r:id="rId9"/>
       <w:pgSz w:w="11906" w:h="16838" w:code="9"/>
       <w:pgMar w:top="1134" w:right="1134" w:bottom="1134" w:left="1134" w:header="720" w:footer="720" w:gutter="0"/>
       <w:cols w:space="720"/>
@@ -2527,7 +2460,6 @@
   <w:style w:type="character" w:default="1" w:styleId="DefaultParagraphFont">
     <w:name w:val="Default Paragraph Font"/>
     <w:uiPriority w:val="1"/>
-    <w:semiHidden/>
     <w:unhideWhenUsed/>
   </w:style>
   <w:style w:type="table" w:default="1" w:styleId="TableNormal">
@@ -2797,6 +2729,18 @@
       </w:tblBorders>
     </w:tblPr>
   </w:style>
+  <w:style w:type="character" w:styleId="Hyperlink">
+    <w:name w:val="Hyperlink"/>
+    <w:basedOn w:val="DefaultParagraphFont"/>
+    <w:uiPriority w:val="99"/>
+    <w:semiHidden/>
+    <w:unhideWhenUsed/>
+    <w:rsid w:val="003121EA"/>
+    <w:rPr>
+      <w:color w:val="0000FF"/>
+      <w:u w:val="single"/>
+    </w:rPr>
+  </w:style>
 </w:styles>
 </file>
 

</xml_diff>